<commit_message>
chore: use case description added.
</commit_message>
<xml_diff>
--- a/Software Design and Analysis (CS3004)/Project/Deliverable 1/Penance-Deliverable 1 Use Case Description.docx
+++ b/Software Design and Analysis (CS3004)/Project/Deliverable 1/Penance-Deliverable 1 Use Case Description.docx
@@ -4272,15 +4272,7 @@
                 <w:sz w:val="24"/>
                 <w:szCs w:val="24"/>
               </w:rPr>
-              <w:t>Layer</w:t>
-            </w:r>
-            <w:r>
-              <w:rPr>
-                <w:rFonts w:asciiTheme="majorBidi" w:eastAsia="Times New Roman" w:hAnsiTheme="majorBidi" w:cstheme="majorBidi"/>
-                <w:sz w:val="24"/>
-                <w:szCs w:val="24"/>
-              </w:rPr>
-              <w:t xml:space="preserve"> progresses in the story.</w:t>
+              <w:t>Layer progresses in the story.</w:t>
             </w:r>
           </w:p>
         </w:tc>
@@ -4339,16 +4331,7 @@
           <w:bCs/>
           <w:color w:val="auto"/>
         </w:rPr>
-        <w:t>7</w:t>
-      </w:r>
-      <w:r>
-        <w:rPr>
-          <w:rFonts w:asciiTheme="majorBidi" w:hAnsiTheme="majorBidi" w:cstheme="majorBidi"/>
-          <w:b/>
-          <w:bCs/>
-          <w:color w:val="auto"/>
-        </w:rPr>
-        <w:t>. Choose Narrative Path</w:t>
+        <w:t>7. Choose Narrative Path</w:t>
       </w:r>
     </w:p>
     <w:p>
@@ -7505,15 +7488,7 @@
           <w:b/>
           <w:color w:val="auto"/>
         </w:rPr>
-        <w:t>9</w:t>
-      </w:r>
-      <w:r>
-        <w:rPr>
-          <w:rFonts w:asciiTheme="majorBidi" w:eastAsia="Times New Roman" w:hAnsiTheme="majorBidi" w:cstheme="majorBidi"/>
-          <w:b/>
-          <w:color w:val="auto"/>
-        </w:rPr>
-        <w:t>. Attack Player</w:t>
+        <w:t>9. Attack Player</w:t>
       </w:r>
     </w:p>
     <w:p>
@@ -8072,15 +8047,7 @@
           <w:color w:val="auto"/>
         </w:rPr>
         <w:lastRenderedPageBreak/>
-        <w:t>10</w:t>
-      </w:r>
-      <w:r>
-        <w:rPr>
-          <w:rFonts w:asciiTheme="majorBidi" w:eastAsia="Times New Roman" w:hAnsiTheme="majorBidi" w:cstheme="majorBidi"/>
-          <w:b/>
-          <w:color w:val="auto"/>
-        </w:rPr>
-        <w:t>. Chase Player</w:t>
+        <w:t>10. Chase Player</w:t>
       </w:r>
     </w:p>
     <w:p>
@@ -13030,6 +12997,109 @@
           <w:szCs w:val="24"/>
         </w:rPr>
       </w:pPr>
+    </w:p>
+    <w:p>
+      <w:pPr>
+        <w:pStyle w:val="Heading2"/>
+        <w:rPr>
+          <w:rFonts w:asciiTheme="majorBidi" w:hAnsiTheme="majorBidi" w:cstheme="majorBidi"/>
+          <w:b/>
+          <w:bCs/>
+        </w:rPr>
+      </w:pPr>
+      <w:r>
+        <w:rPr>
+          <w:rFonts w:asciiTheme="majorBidi" w:hAnsiTheme="majorBidi" w:cstheme="majorBidi"/>
+          <w:b/>
+          <w:bCs/>
+        </w:rPr>
+        <w:t>Group members:</w:t>
+      </w:r>
+    </w:p>
+    <w:p>
+      <w:pPr>
+        <w:rPr>
+          <w:rFonts w:asciiTheme="majorBidi" w:hAnsiTheme="majorBidi" w:cstheme="majorBidi"/>
+          <w:sz w:val="24"/>
+          <w:szCs w:val="24"/>
+        </w:rPr>
+      </w:pPr>
+      <w:r>
+        <w:rPr>
+          <w:rFonts w:asciiTheme="majorBidi" w:hAnsiTheme="majorBidi" w:cstheme="majorBidi"/>
+          <w:sz w:val="24"/>
+          <w:szCs w:val="24"/>
+        </w:rPr>
+        <w:t>Ahsan Baig 23L-0515</w:t>
+      </w:r>
+    </w:p>
+    <w:p>
+      <w:pPr>
+        <w:rPr>
+          <w:rFonts w:asciiTheme="majorBidi" w:hAnsiTheme="majorBidi" w:cstheme="majorBidi"/>
+          <w:sz w:val="24"/>
+          <w:szCs w:val="24"/>
+        </w:rPr>
+      </w:pPr>
+      <w:r>
+        <w:rPr>
+          <w:rFonts w:asciiTheme="majorBidi" w:hAnsiTheme="majorBidi" w:cstheme="majorBidi"/>
+          <w:sz w:val="24"/>
+          <w:szCs w:val="24"/>
+        </w:rPr>
+        <w:t>Eesa Shoaib 23L-0600</w:t>
+      </w:r>
+    </w:p>
+    <w:p>
+      <w:pPr>
+        <w:rPr>
+          <w:rFonts w:asciiTheme="majorBidi" w:hAnsiTheme="majorBidi" w:cstheme="majorBidi"/>
+          <w:sz w:val="24"/>
+          <w:szCs w:val="24"/>
+        </w:rPr>
+      </w:pPr>
+      <w:r>
+        <w:rPr>
+          <w:rFonts w:asciiTheme="majorBidi" w:hAnsiTheme="majorBidi" w:cstheme="majorBidi"/>
+          <w:sz w:val="24"/>
+          <w:szCs w:val="24"/>
+        </w:rPr>
+        <w:t>Harris Tabassum 23L-0551</w:t>
+      </w:r>
+    </w:p>
+    <w:p>
+      <w:pPr>
+        <w:rPr>
+          <w:rFonts w:asciiTheme="majorBidi" w:hAnsiTheme="majorBidi" w:cstheme="majorBidi"/>
+          <w:sz w:val="24"/>
+          <w:szCs w:val="24"/>
+        </w:rPr>
+      </w:pPr>
+      <w:r>
+        <w:rPr>
+          <w:rFonts w:asciiTheme="majorBidi" w:hAnsiTheme="majorBidi" w:cstheme="majorBidi"/>
+          <w:sz w:val="24"/>
+          <w:szCs w:val="24"/>
+        </w:rPr>
+        <w:t>Husnain Barkat Ali 23L-0860</w:t>
+      </w:r>
+    </w:p>
+    <w:p>
+      <w:pPr>
+        <w:rPr>
+          <w:rFonts w:asciiTheme="majorBidi" w:hAnsiTheme="majorBidi" w:cstheme="majorBidi"/>
+          <w:sz w:val="24"/>
+          <w:szCs w:val="24"/>
+        </w:rPr>
+      </w:pPr>
+      <w:r>
+        <w:rPr>
+          <w:rFonts w:asciiTheme="majorBidi" w:hAnsiTheme="majorBidi" w:cstheme="majorBidi"/>
+          <w:sz w:val="24"/>
+          <w:szCs w:val="24"/>
+        </w:rPr>
+        <w:t>Abdullah Mushtaq 23L-0892</w:t>
+      </w:r>
     </w:p>
     <w:sectPr>
       <w:headerReference w:type="default" r:id="rId7"/>

</xml_diff>